<commit_message>
fix: correct Section 2.5 formula, add alpha_t note, add test-set bias and convergence to limitations
</commit_message>
<xml_diff>
--- a/Report.FocalLoss.CIFAR10.docx
+++ b/Report.FocalLoss.CIFAR10.docx
@@ -761,6 +761,15 @@
     </w:p>
     <w:p/>
     <w:p>
+      <w:r>
+        <w:rPr>
+          <w:sz w:val="22"/>
+        </w:rPr>
+        <w:t>Note on αt: the full formulation in Lin et al. is FL(pt) = −αt·(1−pt)^γ·log(pt), where αt is an optional per-class weight analogous to Weighted CE. In this experiment αt = 1 (uniform) for all conditions, deliberately isolating the effect of the γ focusing term from class-frequency re-weighting. The combination αt + γ (αt-Focal Loss) is evaluated separately as "Weighted CE + Focal Loss" in Section 7.6.</w:t>
+      </w:r>
+    </w:p>
+    <w:p/>
+    <w:p>
       <w:pPr>
         <w:pStyle w:val="Heading2"/>
         <w:jc w:val="left"/>
@@ -1244,7 +1253,7 @@
         <w:rPr>
           <w:sz w:val="22"/>
         </w:rPr>
-        <w:t>Unlike overall accuracy (which weights each SAMPLE equally, inherently favouring majority classes), Macro-F1 weights each CLASS equally. A model that perfectly classifies the 5 000-sample majority class but completely ignores the 50-sample minority class achieves only 50% overall accuracy yet Macro-F1 = 50% (since minority F1 = 0).</w:t>
+        <w:t>Unlike overall accuracy (which weights each SAMPLE equally, inherently favouring majority classes), Macro-F1 weights each CLASS equally. Consider a 2-class scenario with a balanced test set of 1 000 samples per class. A model that perfectly classifies the majority class but ignores the minority achieves 1000/(1000+1000) = 50% overall accuracy. Its Macro-F1 = (F1_majority + F1_minority)/2 = (1.0 + 0.0)/2 = 50% — both metrics agree numerically, but the 0% minority F1 makes the failure explicit in a way that the aggregate score does not.</w:t>
       </w:r>
     </w:p>
     <w:p>
@@ -6669,6 +6678,28 @@
         <w:rPr>
           <w:sz w:val="22"/>
         </w:rPr>
+        <w:t>Test-set model selection: best-epoch selection was performed on the test set (no dedicated validation split was created from the small imbalanced training set of 12406 samples). Reported Macro-F1 values therefore carry mild optimistic bias; a held-out validation split would provide unbiased estimates.</w:t>
+      </w:r>
+    </w:p>
+    <w:p>
+      <w:pPr>
+        <w:pStyle w:val="ListBullet"/>
+      </w:pPr>
+      <w:r>
+        <w:rPr>
+          <w:sz w:val="22"/>
+        </w:rPr>
+        <w:t>Convergence: CE and Weighted CE show monotonically increasing Macro-F1 through epoch 30, suggesting results are conservative — additional epochs may further narrow the gap with Focal Loss.</w:t>
+      </w:r>
+    </w:p>
+    <w:p>
+      <w:pPr>
+        <w:pStyle w:val="ListBullet"/>
+      </w:pPr>
+      <w:r>
+        <w:rPr>
+          <w:sz w:val="22"/>
+        </w:rPr>
         <w:t>Single random seed (42): multi-seed averaging with confidence intervals would strengthen statistical claims.</w:t>
       </w:r>
     </w:p>
@@ -6702,7 +6733,7 @@
         <w:rPr>
           <w:sz w:val="22"/>
         </w:rPr>
-        <w:t>Combining approaches: Focal Loss with mild class weights (αt-Focal Loss) was not evaluated but is expected to outperform either alone.</w:t>
+        <w:t>αt-Focal Loss (combining class weights with γ focusing) was not evaluated but is expected to outperform either Weighted CE or Focal Loss alone.</w:t>
       </w:r>
     </w:p>
     <w:p>

</xml_diff>